<commit_message>
Brand: true Ignite vector from the site, Packaging rebuilt from the Canva PDF, TM matched to the Talent lockup
</commit_message>
<xml_diff>
--- a/brand/flex-letterhead.docx
+++ b/brand/flex-letterhead.docx
@@ -280,7 +280,7 @@
           <w:r>
             <w:drawing>
               <wp:inline distT="0" distB="0" distL="0" distR="0">
-                <wp:extent cx="1771650" cy="561975"/>
+                <wp:extent cx="1628775" cy="561975"/>
                 <wp:effectExtent t="0" r="0" b="0" l="0"/>
                 <wp:docPr id="1" name="" descr="" title=""/>
                 <wp:cNvGraphicFramePr>
@@ -305,7 +305,7 @@
                       <pic:spPr bwMode="auto">
                         <a:xfrm>
                           <a:off x="0" y="0"/>
-                          <a:ext cx="1771650" cy="561975"/>
+                          <a:ext cx="1628775" cy="561975"/>
                         </a:xfrm>
                         <a:prstGeom prst="rect">
                           <a:avLst/>

</xml_diff>